<commit_message>
Make Check and MCQ usable with a thumb on phones (mobile phase M1).
Co-authored-by: Cursor <cursoragent@cursor.com>
</commit_message>
<xml_diff>
--- a/docs/AI_HANDOFF.docx
+++ b/docs/AI_HANDOFF.docx
@@ -232,16 +232,16 @@
               <w:rPr>
                 <w:b/>
               </w:rPr>
-              <w:t>M0 shipped</w:t>
+              <w:t>M0–M1 shipped</w:t>
             </w:r>
             <w:r>
-              <w:t xml:space="preserve"> (16px inputs, 1-col forms, overflow-x, safe-area tokens). </w:t>
+              <w:t xml:space="preserve"> (foundation CSS + stacked Check / 44px taps / vertical MCQ). </w:t>
             </w:r>
             <w:r>
               <w:rPr>
                 <w:b/>
               </w:rPr>
-              <w:t>M1–M4</w:t>
+              <w:t>M2–M4</w:t>
             </w:r>
             <w:r>
               <w:t xml:space="preserve"> still planned — see </w:t>
@@ -3378,7 +3378,7 @@
         <w:rPr>
           <w:b/>
         </w:rPr>
-        <w:t>Mobile polish M1</w:t>
+        <w:t>Mobile polish M2</w:t>
       </w:r>
       <w:r>
         <w:t xml:space="preserve"> per </w:t>
@@ -3391,7 +3391,7 @@
         <w:t>docs/MOBILE.md</w:t>
       </w:r>
       <w:r>
-        <w:t xml:space="preserve"> — stack free-response, 44px taps, MCQ list (M0 is done).</w:t>
+        <w:t xml:space="preserve"> — nav sheets, visualViewport, focus/active (M0–M1 are done).</w:t>
       </w:r>
     </w:p>
     <w:p>

</xml_diff>

<commit_message>
Make phone nav, search, and Check feel like an installed app (mobile phase M2).
Bottom sheets, keyboard-aware Check, and focus/active states so one-handed use works without hover-only chrome.

Co-authored-by: Cursor <cursoragent@cursor.com>
</commit_message>
<xml_diff>
--- a/docs/AI_HANDOFF.docx
+++ b/docs/AI_HANDOFF.docx
@@ -18,7 +18,7 @@
         <w:t>Last updated:</w:t>
       </w:r>
       <w:r>
-        <w:t xml:space="preserve"> 2026-08-11</w:t>
+        <w:t xml:space="preserve"> 2026-08-14</w:t>
       </w:r>
     </w:p>
     <w:p>
@@ -232,16 +232,16 @@
               <w:rPr>
                 <w:b/>
               </w:rPr>
-              <w:t>M0–M1 shipped</w:t>
+              <w:t>M0–M2 shipped</w:t>
             </w:r>
             <w:r>
-              <w:t xml:space="preserve"> (foundation CSS + stacked Check / 44px taps / vertical MCQ). </w:t>
+              <w:t xml:space="preserve"> (foundation CSS, practice UX, nav/search sheets + keyboard-aware Check). </w:t>
             </w:r>
             <w:r>
               <w:rPr>
                 <w:b/>
               </w:rPr>
-              <w:t>M2–M4</w:t>
+              <w:t>M3–M4</w:t>
             </w:r>
             <w:r>
               <w:t xml:space="preserve"> still planned — see </w:t>
@@ -3378,7 +3378,7 @@
         <w:rPr>
           <w:b/>
         </w:rPr>
-        <w:t>Mobile polish M2</w:t>
+        <w:t>Mobile polish M3</w:t>
       </w:r>
       <w:r>
         <w:t xml:space="preserve"> per </w:t>
@@ -3391,7 +3391,7 @@
         <w:t>docs/MOBILE.md</w:t>
       </w:r>
       <w:r>
-        <w:t xml:space="preserve"> — nav sheets, visualViewport, focus/active (M0–M1 are done).</w:t>
+        <w:t xml:space="preserve"> — lessons, diagrams, Python honesty (M0–M2 are done).</w:t>
       </w:r>
     </w:p>
     <w:p>

</xml_diff>

<commit_message>
Keep lessons, diagrams, and Python usable on phones (mobile phase M3).
Accordions and quiz CTAs fit thumbs, trees and tables scroll instead of clipping, and Python is honest that it works best on a computer.

Co-authored-by: Cursor <cursoragent@cursor.com>
</commit_message>
<xml_diff>
--- a/docs/AI_HANDOFF.docx
+++ b/docs/AI_HANDOFF.docx
@@ -232,16 +232,16 @@
               <w:rPr>
                 <w:b/>
               </w:rPr>
-              <w:t>M0–M2 shipped</w:t>
+              <w:t>M0–M3 shipped</w:t>
             </w:r>
             <w:r>
-              <w:t xml:space="preserve"> (foundation CSS, practice UX, nav/search sheets + keyboard-aware Check). </w:t>
+              <w:t xml:space="preserve"> (foundation, practice UX, app chrome, lessons/diagrams/Python honesty). </w:t>
             </w:r>
             <w:r>
               <w:rPr>
                 <w:b/>
               </w:rPr>
-              <w:t>M3–M4</w:t>
+              <w:t>M4</w:t>
             </w:r>
             <w:r>
               <w:t xml:space="preserve"> still planned — see </w:t>
@@ -3378,7 +3378,7 @@
         <w:rPr>
           <w:b/>
         </w:rPr>
-        <w:t>Mobile polish M3</w:t>
+        <w:t>Mobile polish M4</w:t>
       </w:r>
       <w:r>
         <w:t xml:space="preserve"> per </w:t>
@@ -3391,7 +3391,7 @@
         <w:t>docs/MOBILE.md</w:t>
       </w:r>
       <w:r>
-        <w:t xml:space="preserve"> — lessons, diagrams, Python honesty (M0–M2 are done).</w:t>
+        <w:t xml:space="preserve"> — PWA polish, device QA matrix, status update (M0–M3 are done).</w:t>
       </w:r>
     </w:p>
     <w:p>

</xml_diff>

<commit_message>
Polish the PWA install experience and close mobile phase M4.
Manifest shortcuts, standalone safe-area chrome, and an iOS Add-to-Home-Screen tip make installed use feel intentional; docs and smoke mark M0–M4 done.

Co-authored-by: Cursor <cursoragent@cursor.com>
</commit_message>
<xml_diff>
--- a/docs/AI_HANDOFF.docx
+++ b/docs/AI_HANDOFF.docx
@@ -232,29 +232,10 @@
               <w:rPr>
                 <w:b/>
               </w:rPr>
-              <w:t>M0–M3 shipped</w:t>
+              <w:t>Done (M0–M4)</w:t>
             </w:r>
             <w:r>
-              <w:t xml:space="preserve"> (foundation, practice UX, app chrome, lessons/diagrams/Python honesty). </w:t>
-            </w:r>
-            <w:r>
-              <w:rPr>
-                <w:b/>
-              </w:rPr>
-              <w:t>M4</w:t>
-            </w:r>
-            <w:r>
-              <w:t xml:space="preserve"> still planned — see </w:t>
-            </w:r>
-            <w:r>
-              <w:rPr>
-                <w:rFonts w:ascii="Consolas" w:hAnsi="Consolas"/>
-                <w:sz w:val="20"/>
-              </w:rPr>
-              <w:t>docs/MOBILE.md</w:t>
-            </w:r>
-            <w:r>
-              <w:t xml:space="preserve">. </w:t>
+              <w:t xml:space="preserve"> — foundation, practice UX, app chrome, lessons/diagrams, PWA polish + device QA. </w:t>
             </w:r>
             <w:r>
               <w:rPr>
@@ -263,7 +244,14 @@
               <w:t>M5–M7</w:t>
             </w:r>
             <w:r>
-              <w:t xml:space="preserve"> HTTPS → TWA → Play Android after M4</w:t>
+              <w:t xml:space="preserve"> HTTPS → TWA → Play Android when a production URL exists — see </w:t>
+            </w:r>
+            <w:r>
+              <w:rPr>
+                <w:rFonts w:ascii="Consolas" w:hAnsi="Consolas"/>
+                <w:sz w:val="20"/>
+              </w:rPr>
+              <w:t>docs/MOBILE.md</w:t>
             </w:r>
           </w:p>
         </w:tc>
@@ -3378,10 +3366,10 @@
         <w:rPr>
           <w:b/>
         </w:rPr>
-        <w:t>Mobile polish M4</w:t>
+        <w:t>Mobile M5+</w:t>
       </w:r>
       <w:r>
-        <w:t xml:space="preserve"> per </w:t>
+        <w:t xml:space="preserve"> only with a real production HTTPS URL — see </w:t>
       </w:r>
       <w:r>
         <w:rPr>
@@ -3391,7 +3379,7 @@
         <w:t>docs/MOBILE.md</w:t>
       </w:r>
       <w:r>
-        <w:t xml:space="preserve"> — PWA polish, device QA matrix, status update (M0–M3 are done).</w:t>
+        <w:t xml:space="preserve"> (M0–M4 done). Optional: confirm device QA on a physical phone before Play screenshots.</w:t>
       </w:r>
     </w:p>
     <w:p>

</xml_diff>

<commit_message>
Ship engagement E1: lesson-assist smoke and a daily bot QOTD card.
Mock assist is asserted in CI, and logged-in feeds show one @problem_bot challenge per UTC day without requiring mascot art. Tokens for later avatars and the buddy live in docs/ENGAGEMENT_VISUAL.md.

Co-authored-by: Cursor <cursoragent@cursor.com>
</commit_message>
<xml_diff>
--- a/docs/AI_HANDOFF.docx
+++ b/docs/AI_HANDOFF.docx
@@ -18,7 +18,7 @@
         <w:t>Last updated:</w:t>
       </w:r>
       <w:r>
-        <w:t xml:space="preserve"> 2026-08-14</w:t>
+        <w:t xml:space="preserve"> 2026-08-15</w:t>
       </w:r>
     </w:p>
     <w:p>
@@ -281,10 +281,36 @@
               <w:rPr>
                 <w:b/>
               </w:rPr>
-              <w:t>Planned, not implemented</w:t>
+              <w:t>E1 shipped</w:t>
             </w:r>
             <w:r>
-              <w:t xml:space="preserve"> — see §6 below</w:t>
+              <w:t xml:space="preserve"> (lesson-assist mock smoke + daily </w:t>
+            </w:r>
+            <w:r>
+              <w:rPr>
+                <w:rFonts w:ascii="Consolas" w:hAnsi="Consolas"/>
+                <w:sz w:val="20"/>
+              </w:rPr>
+              <w:t>@problem_bot</w:t>
+            </w:r>
+            <w:r>
+              <w:t xml:space="preserve"> QOTD card). </w:t>
+            </w:r>
+            <w:r>
+              <w:rPr>
+                <w:b/>
+              </w:rPr>
+              <w:t>E2–E3 planned</w:t>
+            </w:r>
+            <w:r>
+              <w:t xml:space="preserve"> — see §6. Visual tokens: </w:t>
+            </w:r>
+            <w:r>
+              <w:rPr>
+                <w:rFonts w:ascii="Consolas" w:hAnsi="Consolas"/>
+                <w:sz w:val="20"/>
+              </w:rPr>
+              <w:t>docs/ENGAGEMENT_VISUAL.md</w:t>
             </w:r>
           </w:p>
         </w:tc>
@@ -886,6 +912,45 @@
             <w:r/>
             <w:r>
               <w:t>Weekly digest only</w:t>
+            </w:r>
+          </w:p>
+        </w:tc>
+      </w:tr>
+      <w:tr>
+        <w:tc>
+          <w:tcPr>
+            <w:tcW w:type="dxa" w:w="2880"/>
+          </w:tcPr>
+          <w:p>
+            <w:r/>
+            <w:r>
+              <w:t>*as needed*</w:t>
+            </w:r>
+          </w:p>
+        </w:tc>
+        <w:tc>
+          <w:tcPr>
+            <w:tcW w:type="dxa" w:w="2880"/>
+          </w:tcPr>
+          <w:p>
+            <w:r/>
+            <w:r>
+              <w:rPr>
+                <w:rFonts w:ascii="Consolas" w:hAnsi="Consolas"/>
+                <w:sz w:val="20"/>
+              </w:rPr>
+              <w:t>docs/ENGAGEMENT_VISUAL.md</w:t>
+            </w:r>
+          </w:p>
+        </w:tc>
+        <w:tc>
+          <w:tcPr>
+            <w:tcW w:type="dxa" w:w="2880"/>
+          </w:tcPr>
+          <w:p>
+            <w:r/>
+            <w:r>
+              <w:t>Avatar / buddy colour and emoji tokens (after E1)</w:t>
             </w:r>
           </w:p>
         </w:tc>
@@ -1620,6 +1685,54 @@
           <w:p>
             <w:r/>
             <w:r>
+              <w:t>System bot / daily QOTD card</w:t>
+            </w:r>
+          </w:p>
+        </w:tc>
+        <w:tc>
+          <w:tcPr>
+            <w:tcW w:type="dxa" w:w="4320"/>
+          </w:tcPr>
+          <w:p>
+            <w:r/>
+            <w:r>
+              <w:rPr>
+                <w:rFonts w:ascii="Consolas" w:hAnsi="Consolas"/>
+                <w:sz w:val="20"/>
+              </w:rPr>
+              <w:t>models/bot.py</w:t>
+            </w:r>
+            <w:r>
+              <w:t xml:space="preserve">, feed template + </w:t>
+            </w:r>
+            <w:r>
+              <w:rPr>
+                <w:rFonts w:ascii="Consolas" w:hAnsi="Consolas"/>
+                <w:sz w:val="20"/>
+              </w:rPr>
+              <w:t>/api/v1/feed</w:t>
+            </w:r>
+            <w:r>
+              <w:t xml:space="preserve"> </w:t>
+            </w:r>
+            <w:r>
+              <w:rPr>
+                <w:rFonts w:ascii="Consolas" w:hAnsi="Consolas"/>
+                <w:sz w:val="20"/>
+              </w:rPr>
+              <w:t>qotd_challenge</w:t>
+            </w:r>
+          </w:p>
+        </w:tc>
+      </w:tr>
+      <w:tr>
+        <w:tc>
+          <w:tcPr>
+            <w:tcW w:type="dxa" w:w="4320"/>
+          </w:tcPr>
+          <w:p>
+            <w:r/>
+            <w:r>
               <w:t>Generators</w:t>
             </w:r>
           </w:p>
@@ -1876,7 +1989,7 @@
         <w:pStyle w:val="Heading1"/>
       </w:pPr>
       <w:r>
-        <w:t>6. Engagement roadmap (Phases E1–E3) — planned</w:t>
+        <w:t>6. Engagement roadmap (Phases E1–E3)</w:t>
       </w:r>
     </w:p>
     <w:p>
@@ -1887,7 +2000,7 @@
         <w:rPr>
           <w:b/>
         </w:rPr>
-        <w:t>Not implemented yet.</w:t>
+        <w:t>E1 is shipped.</w:t>
       </w:r>
       <w:r>
         <w:t xml:space="preserve"> Stretch / content-depth items are </w:t>
@@ -1909,7 +2022,17 @@
         <w:t>docs/POTENTIAL_FUTURE_FUNCTIONALITY.md</w:t>
       </w:r>
       <w:r>
-        <w:t xml:space="preserve"> §3.0.</w:t>
+        <w:t xml:space="preserve"> §3.0. Light visual tokens for E2–E3: </w:t>
+      </w:r>
+      <w:r>
+        <w:rPr>
+          <w:rFonts w:ascii="Consolas" w:hAnsi="Consolas"/>
+          <w:sz w:val="20"/>
+        </w:rPr>
+        <w:t>docs/ENGAGEMENT_VISUAL.md</w:t>
+      </w:r>
+      <w:r>
+        <w:t>.</w:t>
       </w:r>
     </w:p>
     <w:p>
@@ -2455,7 +2578,56 @@
         <w:t>E1 exit:</w:t>
       </w:r>
       <w:r>
-        <w:t xml:space="preserve"> Assist smoke green in CI (mock); logged-in user sees a daily mascot/QOTD challenge in the feed.</w:t>
+        <w:t xml:space="preserve"> Assist smoke green in CI (mock); logged-in user sees a daily mascot/QOTD challenge in the feed. </w:t>
+      </w:r>
+      <w:r>
+        <w:rPr>
+          <w:b/>
+        </w:rPr>
+        <w:t>Shipped 2026-08-15</w:t>
+      </w:r>
+      <w:r>
+        <w:t xml:space="preserve"> (</w:t>
+      </w:r>
+      <w:r>
+        <w:rPr>
+          <w:rFonts w:ascii="Consolas" w:hAnsi="Consolas"/>
+          <w:sz w:val="20"/>
+        </w:rPr>
+        <w:t>scripts/test_lesson_assist_smoke.py</w:t>
+      </w:r>
+      <w:r>
+        <w:t xml:space="preserve">, </w:t>
+      </w:r>
+      <w:r>
+        <w:rPr>
+          <w:rFonts w:ascii="Consolas" w:hAnsi="Consolas"/>
+          <w:sz w:val="20"/>
+        </w:rPr>
+        <w:t>scripts/test_bot_qotd_smoke.py</w:t>
+      </w:r>
+      <w:r>
+        <w:t xml:space="preserve">, </w:t>
+      </w:r>
+      <w:r>
+        <w:rPr>
+          <w:rFonts w:ascii="Consolas" w:hAnsi="Consolas"/>
+          <w:sz w:val="20"/>
+        </w:rPr>
+        <w:t>@problem_bot</w:t>
+      </w:r>
+      <w:r>
+        <w:t xml:space="preserve"> card on </w:t>
+      </w:r>
+      <w:r>
+        <w:rPr>
+          <w:rFonts w:ascii="Consolas" w:hAnsi="Consolas"/>
+          <w:sz w:val="20"/>
+        </w:rPr>
+        <w:t>/feed</w:t>
+      </w:r>
+      <w:r>
+        <w:t>).</w:t>
       </w:r>
     </w:p>
     <w:p/>
@@ -3366,20 +3538,20 @@
         <w:rPr>
           <w:b/>
         </w:rPr>
-        <w:t>Mobile M5+</w:t>
+        <w:t>Engagement E2</w:t>
       </w:r>
       <w:r>
-        <w:t xml:space="preserve"> only with a real production HTTPS URL — see </w:t>
+        <w:t xml:space="preserve"> (§6) — FTS lesson search + simple emoji/colour avatars (</w:t>
       </w:r>
       <w:r>
         <w:rPr>
           <w:rFonts w:ascii="Consolas" w:hAnsi="Consolas"/>
           <w:sz w:val="20"/>
         </w:rPr>
-        <w:t>docs/MOBILE.md</w:t>
+        <w:t>docs/ENGAGEMENT_VISUAL.md</w:t>
       </w:r>
       <w:r>
-        <w:t xml:space="preserve"> (M0–M4 done). Optional: confirm device QA on a physical phone before Play screenshots.</w:t>
+        <w:t>).</w:t>
       </w:r>
     </w:p>
     <w:p>
@@ -3390,24 +3562,10 @@
         <w:rPr>
           <w:b/>
         </w:rPr>
-        <w:t>Engagement E1</w:t>
+        <w:t>Engagement E3</w:t>
       </w:r>
       <w:r>
-        <w:t xml:space="preserve"> (§6) — assist smoke + mascot QOTD feed (fast wins).</w:t>
-      </w:r>
-    </w:p>
-    <w:p>
-      <w:pPr>
-        <w:pStyle w:val="ListNumber"/>
-      </w:pPr>
-      <w:r>
-        <w:rPr>
-          <w:b/>
-        </w:rPr>
-        <w:t>Engagement E2 → E3</w:t>
-      </w:r>
-      <w:r>
-        <w:t xml:space="preserve"> — FTS search, avatars, alien buddy, friend accuracy leaderboard.</w:t>
+        <w:t xml:space="preserve"> — alien buddy widget + friend-only weekly quiz-accuracy leaderboard.</w:t>
       </w:r>
     </w:p>
     <w:p>
@@ -3432,6 +3590,30 @@
       </w:r>
       <w:r>
         <w:t xml:space="preserve"> §2.</w:t>
+      </w:r>
+    </w:p>
+    <w:p>
+      <w:pPr>
+        <w:pStyle w:val="ListNumber"/>
+      </w:pPr>
+      <w:r>
+        <w:rPr>
+          <w:b/>
+        </w:rPr>
+        <w:t>Mobile M5+</w:t>
+      </w:r>
+      <w:r>
+        <w:t xml:space="preserve"> only with a real production HTTPS URL — see </w:t>
+      </w:r>
+      <w:r>
+        <w:rPr>
+          <w:rFonts w:ascii="Consolas" w:hAnsi="Consolas"/>
+          <w:sz w:val="20"/>
+        </w:rPr>
+        <w:t>docs/MOBILE.md</w:t>
+      </w:r>
+      <w:r>
+        <w:t xml:space="preserve"> (M0–M4 done).</w:t>
       </w:r>
     </w:p>
     <w:p>

</xml_diff>

<commit_message>
Ship engagement E2: FTS lesson search and emoji avatars.
Index lesson body text so search finds topics by keywords, and let users pick a safe emoji/colour avatar that shows on profiles, feed, and leaderboards.

Co-authored-by: Cursor <cursoragent@cursor.com>
</commit_message>
<xml_diff>
--- a/docs/AI_HANDOFF.docx
+++ b/docs/AI_HANDOFF.docx
@@ -281,10 +281,10 @@
               <w:rPr>
                 <w:b/>
               </w:rPr>
-              <w:t>E1 shipped</w:t>
+              <w:t>E1–E2 shipped</w:t>
             </w:r>
             <w:r>
-              <w:t xml:space="preserve"> (lesson-assist mock smoke + daily </w:t>
+              <w:t xml:space="preserve"> (assist mock smoke, </w:t>
             </w:r>
             <w:r>
               <w:rPr>
@@ -294,13 +294,13 @@
               <w:t>@problem_bot</w:t>
             </w:r>
             <w:r>
-              <w:t xml:space="preserve"> QOTD card). </w:t>
+              <w:t xml:space="preserve"> QOTD card, FTS lesson search, emoji/colour avatars). </w:t>
             </w:r>
             <w:r>
               <w:rPr>
                 <w:b/>
               </w:rPr>
-              <w:t>E2–E3 planned</w:t>
+              <w:t>E3 planned</w:t>
             </w:r>
             <w:r>
               <w:t xml:space="preserve"> — see §6. Visual tokens: </w:t>
@@ -1897,7 +1897,58 @@
                 <w:rFonts w:ascii="Consolas" w:hAnsi="Consolas"/>
                 <w:sz w:val="20"/>
               </w:rPr>
+              <w:t>models/lesson_search.py</w:t>
+            </w:r>
+            <w:r>
+              <w:t xml:space="preserve"> (FTS5), </w:t>
+            </w:r>
+            <w:r>
+              <w:rPr>
+                <w:rFonts w:ascii="Consolas" w:hAnsi="Consolas"/>
+                <w:sz w:val="20"/>
+              </w:rPr>
               <w:t>static/js/site-search.js</w:t>
+            </w:r>
+          </w:p>
+        </w:tc>
+      </w:tr>
+      <w:tr>
+        <w:tc>
+          <w:tcPr>
+            <w:tcW w:type="dxa" w:w="4320"/>
+          </w:tcPr>
+          <w:p>
+            <w:r/>
+            <w:r>
+              <w:t>Avatars</w:t>
+            </w:r>
+          </w:p>
+        </w:tc>
+        <w:tc>
+          <w:tcPr>
+            <w:tcW w:type="dxa" w:w="4320"/>
+          </w:tcPr>
+          <w:p>
+            <w:r/>
+            <w:r>
+              <w:rPr>
+                <w:rFonts w:ascii="Consolas" w:hAnsi="Consolas"/>
+                <w:sz w:val="20"/>
+              </w:rPr>
+              <w:t>models/avatar.py</w:t>
+            </w:r>
+            <w:r>
+              <w:t xml:space="preserve">, </w:t>
+            </w:r>
+            <w:r>
+              <w:rPr>
+                <w:rFonts w:ascii="Consolas" w:hAnsi="Consolas"/>
+                <w:sz w:val="20"/>
+              </w:rPr>
+              <w:t>user_profile_settings.avatar_json</w:t>
+            </w:r>
+            <w:r>
+              <w:t>, settings picker</w:t>
             </w:r>
           </w:p>
         </w:tc>
@@ -2000,7 +2051,7 @@
         <w:rPr>
           <w:b/>
         </w:rPr>
-        <w:t>E1 is shipped.</w:t>
+        <w:t>E1 and E2 are shipped.</w:t>
       </w:r>
       <w:r>
         <w:t xml:space="preserve"> Stretch / content-depth items are </w:t>
@@ -2022,7 +2073,7 @@
         <w:t>docs/POTENTIAL_FUTURE_FUNCTIONALITY.md</w:t>
       </w:r>
       <w:r>
-        <w:t xml:space="preserve"> §3.0. Light visual tokens for E2–E3: </w:t>
+        <w:t xml:space="preserve"> §3.0. Light visual tokens for E3: </w:t>
       </w:r>
       <w:r>
         <w:rPr>
@@ -3058,7 +3109,56 @@
         <w:t>E2 exit:</w:t>
       </w:r>
       <w:r>
-        <w:t xml:space="preserve"> Search returns lesson-keyword hits; users can set and see a simple avatar.</w:t>
+        <w:t xml:space="preserve"> Search returns lesson-keyword hits; users can set and see a simple avatar. </w:t>
+      </w:r>
+      <w:r>
+        <w:rPr>
+          <w:b/>
+        </w:rPr>
+        <w:t>Shipped 2026-08-15</w:t>
+      </w:r>
+      <w:r>
+        <w:t xml:space="preserve"> (</w:t>
+      </w:r>
+      <w:r>
+        <w:rPr>
+          <w:rFonts w:ascii="Consolas" w:hAnsi="Consolas"/>
+          <w:sz w:val="20"/>
+        </w:rPr>
+        <w:t>models/lesson_search.py</w:t>
+      </w:r>
+      <w:r>
+        <w:t xml:space="preserve">, </w:t>
+      </w:r>
+      <w:r>
+        <w:rPr>
+          <w:rFonts w:ascii="Consolas" w:hAnsi="Consolas"/>
+          <w:sz w:val="20"/>
+        </w:rPr>
+        <w:t>models/avatar.py</w:t>
+      </w:r>
+      <w:r>
+        <w:t xml:space="preserve">, </w:t>
+      </w:r>
+      <w:r>
+        <w:rPr>
+          <w:rFonts w:ascii="Consolas" w:hAnsi="Consolas"/>
+          <w:sz w:val="20"/>
+        </w:rPr>
+        <w:t>scripts/test_user_search_smoke.py</w:t>
+      </w:r>
+      <w:r>
+        <w:t xml:space="preserve">, </w:t>
+      </w:r>
+      <w:r>
+        <w:rPr>
+          <w:rFonts w:ascii="Consolas" w:hAnsi="Consolas"/>
+          <w:sz w:val="20"/>
+        </w:rPr>
+        <w:t>scripts/test_avatar_smoke.py</w:t>
+      </w:r>
+      <w:r>
+        <w:t>).</w:t>
       </w:r>
     </w:p>
     <w:p/>
@@ -3538,34 +3638,10 @@
         <w:rPr>
           <w:b/>
         </w:rPr>
-        <w:t>Engagement E2</w:t>
-      </w:r>
-      <w:r>
-        <w:t xml:space="preserve"> (§6) — FTS lesson search + simple emoji/colour avatars (</w:t>
-      </w:r>
-      <w:r>
-        <w:rPr>
-          <w:rFonts w:ascii="Consolas" w:hAnsi="Consolas"/>
-          <w:sz w:val="20"/>
-        </w:rPr>
-        <w:t>docs/ENGAGEMENT_VISUAL.md</w:t>
-      </w:r>
-      <w:r>
-        <w:t>).</w:t>
-      </w:r>
-    </w:p>
-    <w:p>
-      <w:pPr>
-        <w:pStyle w:val="ListNumber"/>
-      </w:pPr>
-      <w:r>
-        <w:rPr>
-          <w:b/>
-        </w:rPr>
         <w:t>Engagement E3</w:t>
       </w:r>
       <w:r>
-        <w:t xml:space="preserve"> — alien buddy widget + friend-only weekly quiz-accuracy leaderboard.</w:t>
+        <w:t xml:space="preserve"> (§6) — alien buddy widget + friend-only weekly quiz-accuracy leaderboard.</w:t>
       </w:r>
     </w:p>
     <w:p>

</xml_diff>

<commit_message>
Index lesson HTML so search finds related topics.
Name matches still rank first; stripped lesson pages now feed FTS so queries like Pythagoras also surface trigonometry and similar lessons.

Co-authored-by: Cursor <cursoragent@cursor.com>
</commit_message>
<xml_diff>
--- a/docs/AI_HANDOFF.docx
+++ b/docs/AI_HANDOFF.docx
@@ -1900,7 +1900,7 @@
               <w:t>models/lesson_search.py</w:t>
             </w:r>
             <w:r>
-              <w:t xml:space="preserve"> (FTS5), </w:t>
+              <w:t xml:space="preserve"> (FTS5 over metadata + lesson HTML), </w:t>
             </w:r>
             <w:r>
               <w:rPr>
@@ -3109,7 +3109,7 @@
         <w:t>E2 exit:</w:t>
       </w:r>
       <w:r>
-        <w:t xml:space="preserve"> Search returns lesson-keyword hits; users can set and see a simple avatar. </w:t>
+        <w:t xml:space="preserve"> Search returns lesson-keyword hits (including stripped lesson HTML); users can set and see a simple avatar. </w:t>
       </w:r>
       <w:r>
         <w:rPr>

</xml_diff>

<commit_message>
Ship engagement E3: alien buddy widget and friend quiz-accuracy leaderboard.
Co-authored-by: Cursor <cursoragent@cursor.com>
</commit_message>
<xml_diff>
--- a/docs/AI_HANDOFF.docx
+++ b/docs/AI_HANDOFF.docx
@@ -281,7 +281,7 @@
               <w:rPr>
                 <w:b/>
               </w:rPr>
-              <w:t>E1–E2 shipped</w:t>
+              <w:t>E1–E3 shipped</w:t>
             </w:r>
             <w:r>
               <w:t xml:space="preserve"> (assist mock smoke, </w:t>
@@ -294,16 +294,7 @@
               <w:t>@problem_bot</w:t>
             </w:r>
             <w:r>
-              <w:t xml:space="preserve"> QOTD card, FTS lesson search, emoji/colour avatars). </w:t>
-            </w:r>
-            <w:r>
-              <w:rPr>
-                <w:b/>
-              </w:rPr>
-              <w:t>E3 planned</w:t>
-            </w:r>
-            <w:r>
-              <w:t xml:space="preserve"> — see §6. Visual tokens: </w:t>
+              <w:t xml:space="preserve"> QOTD card, FTS lesson search, emoji/colour avatars, alien buddy, friend quiz-accuracy leaderboard). Visual tokens: </w:t>
             </w:r>
             <w:r>
               <w:rPr>
@@ -1733,6 +1724,54 @@
           <w:p>
             <w:r/>
             <w:r>
+              <w:t>Alien buddy</w:t>
+            </w:r>
+          </w:p>
+        </w:tc>
+        <w:tc>
+          <w:tcPr>
+            <w:tcW w:type="dxa" w:w="4320"/>
+          </w:tcPr>
+          <w:p>
+            <w:r/>
+            <w:r>
+              <w:rPr>
+                <w:rFonts w:ascii="Consolas" w:hAnsi="Consolas"/>
+                <w:sz w:val="20"/>
+              </w:rPr>
+              <w:t>models/buddy.py</w:t>
+            </w:r>
+            <w:r>
+              <w:t xml:space="preserve">, </w:t>
+            </w:r>
+            <w:r>
+              <w:rPr>
+                <w:rFonts w:ascii="Consolas" w:hAnsi="Consolas"/>
+                <w:sz w:val="20"/>
+              </w:rPr>
+              <w:t>static/js/buddy.js</w:t>
+            </w:r>
+            <w:r>
+              <w:t xml:space="preserve">, </w:t>
+            </w:r>
+            <w:r>
+              <w:rPr>
+                <w:rFonts w:ascii="Consolas" w:hAnsi="Consolas"/>
+                <w:sz w:val="20"/>
+              </w:rPr>
+              <w:t>GET /api/v1/me/buddy</w:t>
+            </w:r>
+          </w:p>
+        </w:tc>
+      </w:tr>
+      <w:tr>
+        <w:tc>
+          <w:tcPr>
+            <w:tcW w:type="dxa" w:w="4320"/>
+          </w:tcPr>
+          <w:p>
+            <w:r/>
+            <w:r>
               <w:t>Generators</w:t>
             </w:r>
           </w:p>
@@ -2051,7 +2090,7 @@
         <w:rPr>
           <w:b/>
         </w:rPr>
-        <w:t>E1 and E2 are shipped.</w:t>
+        <w:t>E1–E3 are shipped.</w:t>
       </w:r>
       <w:r>
         <w:t xml:space="preserve"> Stretch / content-depth items are </w:t>
@@ -2073,7 +2112,7 @@
         <w:t>docs/POTENTIAL_FUTURE_FUNCTIONALITY.md</w:t>
       </w:r>
       <w:r>
-        <w:t xml:space="preserve"> §3.0. Light visual tokens for E3: </w:t>
+        <w:t xml:space="preserve"> §3.0. Light visual tokens: </w:t>
       </w:r>
       <w:r>
         <w:rPr>
@@ -3581,7 +3620,46 @@
         <w:t>E3 exit:</w:t>
       </w:r>
       <w:r>
-        <w:t xml:space="preserve"> Buddy appears with at least three message types; friends can see weekly accuracy ranking among their graph.</w:t>
+        <w:t xml:space="preserve"> Buddy appears with at least three message types; friends can see weekly accuracy ranking among their graph. </w:t>
+      </w:r>
+      <w:r>
+        <w:rPr>
+          <w:b/>
+        </w:rPr>
+        <w:t>Shipped 2026-08-15</w:t>
+      </w:r>
+      <w:r>
+        <w:t xml:space="preserve"> (</w:t>
+      </w:r>
+      <w:r>
+        <w:rPr>
+          <w:rFonts w:ascii="Consolas" w:hAnsi="Consolas"/>
+          <w:sz w:val="20"/>
+        </w:rPr>
+        <w:t>models/buddy.py</w:t>
+      </w:r>
+      <w:r>
+        <w:t xml:space="preserve">, </w:t>
+      </w:r>
+      <w:r>
+        <w:rPr>
+          <w:rFonts w:ascii="Consolas" w:hAnsi="Consolas"/>
+          <w:sz w:val="20"/>
+        </w:rPr>
+        <w:t>friend_accuracy_leaderboard</w:t>
+      </w:r>
+      <w:r>
+        <w:t xml:space="preserve">, </w:t>
+      </w:r>
+      <w:r>
+        <w:rPr>
+          <w:rFonts w:ascii="Consolas" w:hAnsi="Consolas"/>
+          <w:sz w:val="20"/>
+        </w:rPr>
+        <w:t>scripts/test_buddy_smoke.py</w:t>
+      </w:r>
+      <w:r>
+        <w:t>).</w:t>
       </w:r>
     </w:p>
     <w:p/>
@@ -3628,20 +3706,6 @@
     <w:p>
       <w:r>
         <w:t>Pick based on product priority; items are independent enough to sequence differently if needed:</w:t>
-      </w:r>
-    </w:p>
-    <w:p>
-      <w:pPr>
-        <w:pStyle w:val="ListNumber"/>
-      </w:pPr>
-      <w:r>
-        <w:rPr>
-          <w:b/>
-        </w:rPr>
-        <w:t>Engagement E3</w:t>
-      </w:r>
-      <w:r>
-        <w:t xml:space="preserve"> (§6) — alien buddy widget + friend-only weekly quiz-accuracy leaderboard.</w:t>
       </w:r>
     </w:p>
     <w:p>

</xml_diff>

<commit_message>
Ship engagement E5.2: four extra badges and catalog emoji on the profile.
Co-authored-by: Cursor <cursoragent@cursor.com>
</commit_message>
<xml_diff>
--- a/docs/AI_HANDOFF.docx
+++ b/docs/AI_HANDOFF.docx
@@ -18,7 +18,7 @@
         <w:t>Last updated:</w:t>
       </w:r>
       <w:r>
-        <w:t xml:space="preserve"> 2026-08-15</w:t>
+        <w:t xml:space="preserve"> 2026-08-16</w:t>
       </w:r>
     </w:p>
     <w:p>
@@ -218,7 +218,7 @@
               <w:rPr>
                 <w:b/>
               </w:rPr>
-              <w:t>Mobile polish (app-like PWA)</w:t>
+              <w:t>Security + UK GDPR compliance</w:t>
             </w:r>
           </w:p>
         </w:tc>
@@ -232,19 +232,19 @@
               <w:rPr>
                 <w:b/>
               </w:rPr>
-              <w:t>Done (M0–M4)</w:t>
-            </w:r>
-            <w:r>
-              <w:t xml:space="preserve"> — foundation, practice UX, app chrome, lessons/diagrams, PWA polish + device QA. </w:t>
+              <w:t>Planned, fully specified — `docs/SECURITY_AND_GDPR.md`.</w:t>
+            </w:r>
+            <w:r>
+              <w:t xml:space="preserve"> Phase </w:t>
             </w:r>
             <w:r>
               <w:rPr>
                 <w:b/>
               </w:rPr>
-              <w:t>M5–M7</w:t>
-            </w:r>
-            <w:r>
-              <w:t xml:space="preserve"> HTTPS → TWA → Play Android when a production URL exists — see </w:t>
+              <w:t>S0 is a launch blocker</w:t>
+            </w:r>
+            <w:r>
+              <w:t xml:space="preserve">: no privacy notice, no account deletion, no data export, no DPIA, public-by-default profiles for a 13+ audience. Do S0 with (not after) </w:t>
             </w:r>
             <w:r>
               <w:rPr>
@@ -252,6 +252,9 @@
                 <w:sz w:val="20"/>
               </w:rPr>
               <w:t>docs/MOBILE.md</w:t>
+            </w:r>
+            <w:r>
+              <w:t xml:space="preserve"> M5</w:t>
             </w:r>
           </w:p>
         </w:tc>
@@ -267,7 +270,7 @@
               <w:rPr>
                 <w:b/>
               </w:rPr>
-              <w:t>Engagement roadmap (E1–E3)</w:t>
+              <w:t>Mobile polish (app-like PWA)</w:t>
             </w:r>
           </w:p>
         </w:tc>
@@ -281,27 +284,26 @@
               <w:rPr>
                 <w:b/>
               </w:rPr>
-              <w:t>E1–E3 shipped</w:t>
-            </w:r>
-            <w:r>
-              <w:t xml:space="preserve"> (assist mock smoke, </w:t>
+              <w:t>Done (M0–M4)</w:t>
+            </w:r>
+            <w:r>
+              <w:t xml:space="preserve"> — foundation, practice UX, app chrome, lessons/diagrams, PWA polish + device QA. </w:t>
+            </w:r>
+            <w:r>
+              <w:rPr>
+                <w:b/>
+              </w:rPr>
+              <w:t>M5–M7</w:t>
+            </w:r>
+            <w:r>
+              <w:t xml:space="preserve"> HTTPS → TWA → Play Android when a production URL exists — see </w:t>
             </w:r>
             <w:r>
               <w:rPr>
                 <w:rFonts w:ascii="Consolas" w:hAnsi="Consolas"/>
                 <w:sz w:val="20"/>
               </w:rPr>
-              <w:t>@problem_bot</w:t>
-            </w:r>
-            <w:r>
-              <w:t xml:space="preserve"> QOTD card, FTS lesson search, emoji/colour avatars, alien buddy, friend quiz-accuracy leaderboard). Visual tokens: </w:t>
-            </w:r>
-            <w:r>
-              <w:rPr>
-                <w:rFonts w:ascii="Consolas" w:hAnsi="Consolas"/>
-                <w:sz w:val="20"/>
-              </w:rPr>
-              <w:t>docs/ENGAGEMENT_VISUAL.md</w:t>
+              <w:t>docs/MOBILE.md</w:t>
             </w:r>
           </w:p>
         </w:tc>
@@ -317,7 +319,7 @@
               <w:rPr>
                 <w:b/>
               </w:rPr>
-              <w:t>G8 teacher / class mode</w:t>
+              <w:t>Engagement roadmap (E1–E3)</w:t>
             </w:r>
           </w:p>
         </w:tc>
@@ -328,17 +330,30 @@
           <w:p>
             <w:r/>
             <w:r>
-              <w:t xml:space="preserve">Designed, not implemented. See </w:t>
+              <w:rPr>
+                <w:b/>
+              </w:rPr>
+              <w:t>E1–E3 shipped</w:t>
+            </w:r>
+            <w:r>
+              <w:t xml:space="preserve"> (assist mock smoke, </w:t>
             </w:r>
             <w:r>
               <w:rPr>
                 <w:rFonts w:ascii="Consolas" w:hAnsi="Consolas"/>
                 <w:sz w:val="20"/>
               </w:rPr>
-              <w:t>docs/POTENTIAL_FUTURE_FUNCTIONALITY.md</w:t>
-            </w:r>
-            <w:r>
-              <w:t xml:space="preserve"> §2</w:t>
+              <w:t>@problem_bot</w:t>
+            </w:r>
+            <w:r>
+              <w:t xml:space="preserve"> QOTD card, FTS lesson search, emoji/colour avatars, alien buddy, friend quiz-accuracy leaderboard). Visual tokens: </w:t>
+            </w:r>
+            <w:r>
+              <w:rPr>
+                <w:rFonts w:ascii="Consolas" w:hAnsi="Consolas"/>
+                <w:sz w:val="20"/>
+              </w:rPr>
+              <w:t>docs/ENGAGEMENT_VISUAL.md</w:t>
             </w:r>
           </w:p>
         </w:tc>
@@ -354,7 +369,7 @@
               <w:rPr>
                 <w:b/>
               </w:rPr>
-              <w:t>Engagement stretch (E4)</w:t>
+              <w:t>G8 teacher / class mode</w:t>
             </w:r>
           </w:p>
         </w:tc>
@@ -365,7 +380,7 @@
           <w:p>
             <w:r/>
             <w:r>
-              <w:t xml:space="preserve">Long-term — see </w:t>
+              <w:t xml:space="preserve">Designed, not implemented. See </w:t>
             </w:r>
             <w:r>
               <w:rPr>
@@ -375,7 +390,140 @@
               <w:t>docs/POTENTIAL_FUTURE_FUNCTIONALITY.md</w:t>
             </w:r>
             <w:r>
-              <w:t xml:space="preserve"> §3.0</w:t>
+              <w:t xml:space="preserve"> §2</w:t>
+            </w:r>
+          </w:p>
+        </w:tc>
+      </w:tr>
+      <w:tr>
+        <w:tc>
+          <w:tcPr>
+            <w:tcW w:type="dxa" w:w="4320"/>
+          </w:tcPr>
+          <w:p>
+            <w:r/>
+            <w:r>
+              <w:rPr>
+                <w:b/>
+              </w:rPr>
+              <w:t>Real-world question style (E4.1)</w:t>
+            </w:r>
+          </w:p>
+        </w:tc>
+        <w:tc>
+          <w:tcPr>
+            <w:tcW w:type="dxa" w:w="4320"/>
+          </w:tcPr>
+          <w:p>
+            <w:r/>
+            <w:r>
+              <w:rPr>
+                <w:b/>
+              </w:rPr>
+              <w:t>Planned, fully specified</w:t>
+            </w:r>
+            <w:r>
+              <w:t xml:space="preserve"> — </w:t>
+            </w:r>
+            <w:r>
+              <w:rPr>
+                <w:rFonts w:ascii="Consolas" w:hAnsi="Consolas"/>
+                <w:sz w:val="20"/>
+              </w:rPr>
+              <w:t>docs/REAL_WORLD_QUESTIONS.md</w:t>
+            </w:r>
+            <w:r>
+              <w:t>. Third generator mode (</w:t>
+            </w:r>
+            <w:r>
+              <w:rPr>
+                <w:rFonts w:ascii="Consolas" w:hAnsi="Consolas"/>
+                <w:sz w:val="20"/>
+              </w:rPr>
+              <w:t>real_world</w:t>
+            </w:r>
+            <w:r>
+              <w:t>) across percentages, ratio, compound measures</w:t>
+            </w:r>
+          </w:p>
+        </w:tc>
+      </w:tr>
+      <w:tr>
+        <w:tc>
+          <w:tcPr>
+            <w:tcW w:type="dxa" w:w="4320"/>
+          </w:tcPr>
+          <w:p>
+            <w:r/>
+            <w:r>
+              <w:rPr>
+                <w:b/>
+              </w:rPr>
+              <w:t>Engagement E5 (retention polish)</w:t>
+            </w:r>
+          </w:p>
+        </w:tc>
+        <w:tc>
+          <w:tcPr>
+            <w:tcW w:type="dxa" w:w="4320"/>
+          </w:tcPr>
+          <w:p>
+            <w:r/>
+            <w:r>
+              <w:rPr>
+                <w:b/>
+              </w:rPr>
+              <w:t>E5.2 shipped 2026-08-16</w:t>
+            </w:r>
+            <w:r>
+              <w:t xml:space="preserve"> (four extra badges). Rest planned — </w:t>
+            </w:r>
+            <w:r>
+              <w:rPr>
+                <w:rFonts w:ascii="Consolas" w:hAnsi="Consolas"/>
+                <w:sz w:val="20"/>
+              </w:rPr>
+              <w:t>docs/ENGAGEMENT_E5.md</w:t>
+            </w:r>
+            <w:r>
+              <w:t>. Buddy v0.5, QOTD week, streak freeze, avatar unlocks, planner dropdown, push (HTTPS-gated)</w:t>
+            </w:r>
+          </w:p>
+        </w:tc>
+      </w:tr>
+      <w:tr>
+        <w:tc>
+          <w:tcPr>
+            <w:tcW w:type="dxa" w:w="4320"/>
+          </w:tcPr>
+          <w:p>
+            <w:r/>
+            <w:r>
+              <w:rPr>
+                <w:b/>
+              </w:rPr>
+              <w:t>Engagement stretch (E4.2–E4.3)</w:t>
+            </w:r>
+          </w:p>
+        </w:tc>
+        <w:tc>
+          <w:tcPr>
+            <w:tcW w:type="dxa" w:w="4320"/>
+          </w:tcPr>
+          <w:p>
+            <w:r/>
+            <w:r>
+              <w:t xml:space="preserve">Long-term — see </w:t>
+            </w:r>
+            <w:r>
+              <w:rPr>
+                <w:rFonts w:ascii="Consolas" w:hAnsi="Consolas"/>
+                <w:sz w:val="20"/>
+              </w:rPr>
+              <w:t>docs/POTENTIAL_FUTURE_FUNCTIONALITY.md</w:t>
+            </w:r>
+            <w:r>
+              <w:t xml:space="preserve"> §3.0 (mascot farm, Desmos-class graphs)</w:t>
             </w:r>
           </w:p>
         </w:tc>
@@ -743,7 +891,7 @@
               <w:rPr>
                 <w:b/>
               </w:rPr>
-              <w:t>4</w:t>
+              <w:t>3b</w:t>
             </w:r>
           </w:p>
         </w:tc>
@@ -758,7 +906,7 @@
                 <w:rFonts w:ascii="Consolas" w:hAnsi="Consolas"/>
                 <w:sz w:val="20"/>
               </w:rPr>
-              <w:t>docs/POTENTIAL_FUTURE_FUNCTIONALITY.md</w:t>
+              <w:t>docs/SECURITY_AND_GDPR.md</w:t>
             </w:r>
           </w:p>
         </w:tc>
@@ -769,7 +917,13 @@
           <w:p>
             <w:r/>
             <w:r>
-              <w:t>G8 design + engagement E4 + other future ideas</w:t>
+              <w:t xml:space="preserve">Compliance gaps, data inventory, and the phased S0–S3 plan. </w:t>
+            </w:r>
+            <w:r>
+              <w:rPr>
+                <w:b/>
+              </w:rPr>
+              <w:t>Read before touching auth, personal data, defaults, or anything that leaves the server</w:t>
             </w:r>
           </w:p>
         </w:tc>
@@ -785,7 +939,7 @@
               <w:rPr>
                 <w:b/>
               </w:rPr>
-              <w:t>5</w:t>
+              <w:t>4</w:t>
             </w:r>
           </w:p>
         </w:tc>
@@ -800,7 +954,7 @@
                 <w:rFonts w:ascii="Consolas" w:hAnsi="Consolas"/>
                 <w:sz w:val="20"/>
               </w:rPr>
-              <w:t>docs/API.md</w:t>
+              <w:t>docs/POTENTIAL_FUTURE_FUNCTIONALITY.md</w:t>
             </w:r>
           </w:p>
         </w:tc>
@@ -811,17 +965,7 @@
           <w:p>
             <w:r/>
             <w:r>
-              <w:t xml:space="preserve">REST </w:t>
-            </w:r>
-            <w:r>
-              <w:rPr>
-                <w:rFonts w:ascii="Consolas" w:hAnsi="Consolas"/>
-                <w:sz w:val="20"/>
-              </w:rPr>
-              <w:t>/api/v1/*</w:t>
-            </w:r>
-            <w:r>
-              <w:t xml:space="preserve"> contracts when touching APIs</w:t>
+              <w:t>G8 design + engagement E4 + other future ideas</w:t>
             </w:r>
           </w:p>
         </w:tc>
@@ -837,7 +981,7 @@
               <w:rPr>
                 <w:b/>
               </w:rPr>
-              <w:t>6</w:t>
+              <w:t>5</w:t>
             </w:r>
           </w:p>
         </w:tc>
@@ -852,7 +996,7 @@
                 <w:rFonts w:ascii="Consolas" w:hAnsi="Consolas"/>
                 <w:sz w:val="20"/>
               </w:rPr>
-              <w:t>docs/DEPLOY.md</w:t>
+              <w:t>docs/API.md</w:t>
             </w:r>
           </w:p>
         </w:tc>
@@ -863,7 +1007,137 @@
           <w:p>
             <w:r/>
             <w:r>
+              <w:t xml:space="preserve">REST </w:t>
+            </w:r>
+            <w:r>
+              <w:rPr>
+                <w:rFonts w:ascii="Consolas" w:hAnsi="Consolas"/>
+                <w:sz w:val="20"/>
+              </w:rPr>
+              <w:t>/api/v1/*</w:t>
+            </w:r>
+            <w:r>
+              <w:t xml:space="preserve"> contracts when touching APIs</w:t>
+            </w:r>
+          </w:p>
+        </w:tc>
+      </w:tr>
+      <w:tr>
+        <w:tc>
+          <w:tcPr>
+            <w:tcW w:type="dxa" w:w="2880"/>
+          </w:tcPr>
+          <w:p>
+            <w:r/>
+            <w:r>
+              <w:rPr>
+                <w:b/>
+              </w:rPr>
+              <w:t>6</w:t>
+            </w:r>
+          </w:p>
+        </w:tc>
+        <w:tc>
+          <w:tcPr>
+            <w:tcW w:type="dxa" w:w="2880"/>
+          </w:tcPr>
+          <w:p>
+            <w:r/>
+            <w:r>
+              <w:rPr>
+                <w:rFonts w:ascii="Consolas" w:hAnsi="Consolas"/>
+                <w:sz w:val="20"/>
+              </w:rPr>
+              <w:t>docs/DEPLOY.md</w:t>
+            </w:r>
+          </w:p>
+        </w:tc>
+        <w:tc>
+          <w:tcPr>
+            <w:tcW w:type="dxa" w:w="2880"/>
+          </w:tcPr>
+          <w:p>
+            <w:r/>
+            <w:r>
               <w:t>Env, HTTPS, backups, smoke, production checklist</w:t>
+            </w:r>
+          </w:p>
+        </w:tc>
+      </w:tr>
+      <w:tr>
+        <w:tc>
+          <w:tcPr>
+            <w:tcW w:type="dxa" w:w="2880"/>
+          </w:tcPr>
+          <w:p>
+            <w:r/>
+            <w:r>
+              <w:t>*before starting E4.1*</w:t>
+            </w:r>
+          </w:p>
+        </w:tc>
+        <w:tc>
+          <w:tcPr>
+            <w:tcW w:type="dxa" w:w="2880"/>
+          </w:tcPr>
+          <w:p>
+            <w:r/>
+            <w:r>
+              <w:rPr>
+                <w:rFonts w:ascii="Consolas" w:hAnsi="Consolas"/>
+                <w:sz w:val="20"/>
+              </w:rPr>
+              <w:t>docs/REAL_WORLD_QUESTIONS.md</w:t>
+            </w:r>
+          </w:p>
+        </w:tc>
+        <w:tc>
+          <w:tcPr>
+            <w:tcW w:type="dxa" w:w="2880"/>
+          </w:tcPr>
+          <w:p>
+            <w:r/>
+            <w:r>
+              <w:t>Step-by-step plan for the real-world generator mode</w:t>
+            </w:r>
+          </w:p>
+        </w:tc>
+      </w:tr>
+      <w:tr>
+        <w:tc>
+          <w:tcPr>
+            <w:tcW w:type="dxa" w:w="2880"/>
+          </w:tcPr>
+          <w:p>
+            <w:r/>
+            <w:r>
+              <w:t>*before starting E5*</w:t>
+            </w:r>
+          </w:p>
+        </w:tc>
+        <w:tc>
+          <w:tcPr>
+            <w:tcW w:type="dxa" w:w="2880"/>
+          </w:tcPr>
+          <w:p>
+            <w:r/>
+            <w:r>
+              <w:rPr>
+                <w:rFonts w:ascii="Consolas" w:hAnsi="Consolas"/>
+                <w:sz w:val="20"/>
+              </w:rPr>
+              <w:t>docs/ENGAGEMENT_E5.md</w:t>
+            </w:r>
+          </w:p>
+        </w:tc>
+        <w:tc>
+          <w:tcPr>
+            <w:tcW w:type="dxa" w:w="2880"/>
+          </w:tcPr>
+          <w:p>
+            <w:r/>
+            <w:r>
+              <w:t>Step-by-step plan for buddy v0.5, badges, QOTD week, streak freeze, avatar unlocks</w:t>
             </w:r>
           </w:p>
         </w:tc>
@@ -1328,6 +1602,72 @@
         <w:t xml:space="preserve"> for learner competition (no global public ranking of minors) — safeguarding default for E3.</w:t>
       </w:r>
     </w:p>
+    <w:p>
+      <w:pPr>
+        <w:pStyle w:val="ListNumber"/>
+      </w:pPr>
+      <w:r>
+        <w:rPr>
+          <w:b/>
+        </w:rPr>
+        <w:t>Never send a handle, email, or user ID to an external AI provider.</w:t>
+      </w:r>
+      <w:r>
+        <w:t xml:space="preserve"> Lesson assist may send lesson text and the student's typed question only, and only when explicitly enabled.</w:t>
+      </w:r>
+    </w:p>
+    <w:p>
+      <w:pPr>
+        <w:pStyle w:val="ListNumber"/>
+      </w:pPr>
+      <w:r>
+        <w:rPr>
+          <w:b/>
+        </w:rPr>
+        <w:t>No analytics, advertising, or third-party tracking.</w:t>
+      </w:r>
+      <w:r>
+        <w:t xml:space="preserve"> The site needs no cookie-consent banner precisely because none exists; adding any requires a consent flow and a rewritten privacy notice in the same release.</w:t>
+      </w:r>
+    </w:p>
+    <w:p>
+      <w:pPr>
+        <w:pStyle w:val="ListNumber"/>
+      </w:pPr>
+      <w:r>
+        <w:rPr>
+          <w:b/>
+        </w:rPr>
+        <w:t>Anything that makes a child more visible to others defaults to off.</w:t>
+      </w:r>
+      <w:r>
+        <w:t xml:space="preserve"> See </w:t>
+      </w:r>
+      <w:r>
+        <w:rPr>
+          <w:rFonts w:ascii="Consolas" w:hAnsi="Consolas"/>
+          <w:sz w:val="20"/>
+        </w:rPr>
+        <w:t>docs/SECURITY_AND_GDPR.md</w:t>
+      </w:r>
+      <w:r>
+        <w:t xml:space="preserve"> §S0.3.</w:t>
+      </w:r>
+    </w:p>
+    <w:p>
+      <w:pPr>
+        <w:pStyle w:val="ListNumber"/>
+      </w:pPr>
+      <w:r>
+        <w:rPr>
+          <w:b/>
+        </w:rPr>
+        <w:t>Never store a raw IP address</w:t>
+      </w:r>
+      <w:r>
+        <w:t xml:space="preserve"> where a keyed hash serves the same purpose (rate-limit and usage buckets are compared, never read back).</w:t>
+      </w:r>
+    </w:p>
     <w:p/>
     <w:p>
       <w:pPr>
@@ -2079,7 +2419,7 @@
         <w:pStyle w:val="Heading1"/>
       </w:pPr>
       <w:r>
-        <w:t>6. Engagement roadmap (Phases E1–E3)</w:t>
+        <w:t>6. Engagement roadmap (E1–E5)</w:t>
       </w:r>
     </w:p>
     <w:p>
@@ -2090,29 +2430,28 @@
         <w:rPr>
           <w:b/>
         </w:rPr>
-        <w:t>E1–E3 are shipped.</w:t>
+        <w:t>E1–E3 are shipped. E5.2 (badges) is shipped.</w:t>
       </w:r>
       <w:r>
-        <w:t xml:space="preserve"> Stretch / content-depth items are </w:t>
+        <w:t xml:space="preserve"> </w:t>
       </w:r>
       <w:r>
         <w:rPr>
           <w:b/>
         </w:rPr>
-        <w:t>Phase E4</w:t>
+        <w:t>E4.1</w:t>
       </w:r>
       <w:r>
-        <w:t xml:space="preserve"> in </w:t>
+        <w:t xml:space="preserve"> (real-world question style) and the rest of </w:t>
       </w:r>
       <w:r>
         <w:rPr>
-          <w:rFonts w:ascii="Consolas" w:hAnsi="Consolas"/>
-          <w:sz w:val="20"/>
+          <w:b/>
         </w:rPr>
-        <w:t>docs/POTENTIAL_FUTURE_FUNCTIONALITY.md</w:t>
+        <w:t>E5</w:t>
       </w:r>
       <w:r>
-        <w:t xml:space="preserve"> §3.0. Light visual tokens: </w:t>
+        <w:t xml:space="preserve"> are planned and have their own step-by-step docs. Light visual tokens: </w:t>
       </w:r>
       <w:r>
         <w:rPr>
@@ -2126,11 +2465,6 @@
       </w:r>
     </w:p>
     <w:p>
-      <w:r>
-        <w:t>Suggested calendar (flexible): E1 ≈ weeks 1–2, E2 ≈ weeks 3–4, E3 ≈ weeks 5–6.</w:t>
-      </w:r>
-    </w:p>
-    <w:p>
       <w:pPr>
         <w:ind w:left="360"/>
       </w:pPr>
@@ -2141,17 +2475,21 @@
         </w:rPr>
         <w:t>flowchart LR</w:t>
         <w:br/>
-        <w:t xml:space="preserve">  E1[E1_Foundation]</w:t>
+        <w:t xml:space="preserve">  E1[E1_Foundation_shipped]</w:t>
         <w:br/>
-        <w:t xml:space="preserve">  E2[E2_Discovery_Identity]</w:t>
+        <w:t xml:space="preserve">  E2[E2_Discovery_Identity_shipped]</w:t>
         <w:br/>
-        <w:t xml:space="preserve">  E3[E3_Sticky_Gamification]</w:t>
+        <w:t xml:space="preserve">  E3[E3_Sticky_Gamification_shipped]</w:t>
         <w:br/>
-        <w:t xml:space="preserve">  E4[E4_Content_Depth_future_doc]</w:t>
+        <w:t xml:space="preserve">  E5[E5_Retention_Polish_in_progress]</w:t>
+        <w:br/>
+        <w:t xml:space="preserve">  E4[E4_1_Real_World_Questions_planned]</w:t>
         <w:br/>
         <w:t xml:space="preserve">  E1 --&gt; E2 --&gt; E3</w:t>
         <w:br/>
-        <w:t xml:space="preserve">  E3 -.-&gt; E4</w:t>
+        <w:t xml:space="preserve">  E3 --&gt; E5</w:t>
+        <w:br/>
+        <w:t xml:space="preserve">  E3 --&gt; E4</w:t>
       </w:r>
     </w:p>
     <w:p>
@@ -3673,7 +4011,7 @@
     </w:p>
     <w:p>
       <w:r>
-        <w:t xml:space="preserve">Documented in </w:t>
+        <w:t xml:space="preserve">Three items were scoped in </w:t>
       </w:r>
       <w:r>
         <w:rPr>
@@ -3682,16 +4020,226 @@
         <w:t>`docs/POTENTIAL_FUTURE_FUNCTIONALITY.md` §3.0</w:t>
       </w:r>
       <w:r>
-        <w:t xml:space="preserve"> (real-world question styles, sub-mascot farm, Desmos-like graphs). Do </w:t>
+        <w:t>. Only the first is worth doing now:</w:t>
+      </w:r>
+    </w:p>
+    <w:tbl>
+      <w:tblPr>
+        <w:tblStyle w:val="TableGrid"/>
+        <w:tblW w:type="auto" w:w="0"/>
+        <w:tblLook w:firstColumn="1" w:firstRow="1" w:lastColumn="0" w:lastRow="0" w:noHBand="0" w:noVBand="1" w:val="04A0"/>
+      </w:tblPr>
+      <w:tblGrid>
+        <w:gridCol w:w="4320"/>
+        <w:gridCol w:w="4320"/>
+      </w:tblGrid>
+      <w:tr>
+        <w:tc>
+          <w:tcPr>
+            <w:tcW w:type="dxa" w:w="4320"/>
+            <w:shd w:fill="E8EEF4" w:val="clear"/>
+          </w:tcPr>
+          <w:p>
+            <w:r/>
+            <w:r>
+              <w:rPr>
+                <w:b/>
+              </w:rPr>
+              <w:t>Item</w:t>
+            </w:r>
+          </w:p>
+        </w:tc>
+        <w:tc>
+          <w:tcPr>
+            <w:tcW w:type="dxa" w:w="4320"/>
+            <w:shd w:fill="E8EEF4" w:val="clear"/>
+          </w:tcPr>
+          <w:p>
+            <w:r/>
+            <w:r>
+              <w:rPr>
+                <w:b/>
+              </w:rPr>
+              <w:t>Verdict</w:t>
+            </w:r>
+          </w:p>
+        </w:tc>
+      </w:tr>
+      <w:tr>
+        <w:tc>
+          <w:tcPr>
+            <w:tcW w:type="dxa" w:w="4320"/>
+          </w:tcPr>
+          <w:p>
+            <w:r/>
+            <w:r>
+              <w:rPr>
+                <w:b/>
+              </w:rPr>
+              <w:t>E4.1 Real-world question styles</w:t>
+            </w:r>
+          </w:p>
+        </w:tc>
+        <w:tc>
+          <w:tcPr>
+            <w:tcW w:type="dxa" w:w="4320"/>
+          </w:tcPr>
+          <w:p>
+            <w:r/>
+            <w:r>
+              <w:rPr>
+                <w:b/>
+              </w:rPr>
+              <w:t>Do this</w:t>
+            </w:r>
+            <w:r>
+              <w:t xml:space="preserve"> — content work plus one new mode string. Full plan: </w:t>
+            </w:r>
+            <w:r>
+              <w:rPr>
+                <w:rFonts w:ascii="Consolas" w:hAnsi="Consolas"/>
+                <w:sz w:val="20"/>
+              </w:rPr>
+              <w:t>docs/REAL_WORLD_QUESTIONS.md</w:t>
+            </w:r>
+          </w:p>
+        </w:tc>
+      </w:tr>
+      <w:tr>
+        <w:tc>
+          <w:tcPr>
+            <w:tcW w:type="dxa" w:w="4320"/>
+          </w:tcPr>
+          <w:p>
+            <w:r/>
+            <w:r>
+              <w:rPr>
+                <w:b/>
+              </w:rPr>
+              <w:t>E4.2 Sub-mascot story / farm</w:t>
+            </w:r>
+          </w:p>
+        </w:tc>
+        <w:tc>
+          <w:tcPr>
+            <w:tcW w:type="dxa" w:w="4320"/>
+          </w:tcPr>
+          <w:p>
+            <w:r/>
+            <w:r>
+              <w:t>Defer — needs its own schema, economy design, and ongoing content</w:t>
+            </w:r>
+          </w:p>
+        </w:tc>
+      </w:tr>
+      <w:tr>
+        <w:tc>
+          <w:tcPr>
+            <w:tcW w:type="dxa" w:w="4320"/>
+          </w:tcPr>
+          <w:p>
+            <w:r/>
+            <w:r>
+              <w:rPr>
+                <w:b/>
+              </w:rPr>
+              <w:t>E4.3 Desmos-like graphing</w:t>
+            </w:r>
+          </w:p>
+        </w:tc>
+        <w:tc>
+          <w:tcPr>
+            <w:tcW w:type="dxa" w:w="4320"/>
+          </w:tcPr>
+          <w:p>
+            <w:r/>
+            <w:r>
+              <w:t>Defer indefinitely — embed a maintained library if graphs are ever requested</w:t>
+            </w:r>
+          </w:p>
+        </w:tc>
+      </w:tr>
+    </w:tbl>
+    <w:p/>
+    <w:p>
+      <w:pPr>
+        <w:pStyle w:val="Heading2"/>
+      </w:pPr>
+      <w:r>
+        <w:t>E5 — Retention polish (E5.2 shipped; rest planned)</w:t>
+      </w:r>
+    </w:p>
+    <w:p>
+      <w:r>
+        <w:t xml:space="preserve">Small extensions of shipped systems, specified in </w:t>
       </w:r>
       <w:r>
         <w:rPr>
           <w:b/>
         </w:rPr>
-        <w:t>not</w:t>
+        <w:t>`docs/ENGAGEMENT_E5.md`</w:t>
       </w:r>
       <w:r>
-        <w:t xml:space="preserve"> start E4 until E1–E3 engagement metrics justify it.</w:t>
+        <w:t xml:space="preserve">. </w:t>
+      </w:r>
+      <w:r>
+        <w:rPr>
+          <w:b/>
+        </w:rPr>
+        <w:t>E5.2 shipped 2026-08-16:</w:t>
+      </w:r>
+      <w:r>
+        <w:t xml:space="preserve"> four extra badges (</w:t>
+      </w:r>
+      <w:r>
+        <w:rPr>
+          <w:rFonts w:ascii="Consolas" w:hAnsi="Consolas"/>
+          <w:sz w:val="20"/>
+        </w:rPr>
+        <w:t>qotd_first</w:t>
+      </w:r>
+      <w:r>
+        <w:t xml:space="preserve">, </w:t>
+      </w:r>
+      <w:r>
+        <w:rPr>
+          <w:rFonts w:ascii="Consolas" w:hAnsi="Consolas"/>
+          <w:sz w:val="20"/>
+        </w:rPr>
+        <w:t>qotd_7</w:t>
+      </w:r>
+      <w:r>
+        <w:t xml:space="preserve">, </w:t>
+      </w:r>
+      <w:r>
+        <w:rPr>
+          <w:rFonts w:ascii="Consolas" w:hAnsi="Consolas"/>
+          <w:sz w:val="20"/>
+        </w:rPr>
+        <w:t>questions_50</w:t>
+      </w:r>
+      <w:r>
+        <w:t xml:space="preserve">, </w:t>
+      </w:r>
+      <w:r>
+        <w:rPr>
+          <w:rFonts w:ascii="Consolas" w:hAnsi="Consolas"/>
+          <w:sz w:val="20"/>
+        </w:rPr>
+        <w:t>accuracy_top_friend</w:t>
+      </w:r>
+      <w:r>
+        <w:t xml:space="preserve">) plus catalog emoji on the profile. Remaining: buddy v0.5, 7-day friends-only QOTD board, weekly streak freeze, avatar extras gated on milestones, revision planner subject dropdown, and web push (blocked on production HTTPS / </w:t>
+      </w:r>
+      <w:r>
+        <w:rPr>
+          <w:rFonts w:ascii="Consolas" w:hAnsi="Consolas"/>
+          <w:sz w:val="20"/>
+        </w:rPr>
+        <w:t>docs/MOBILE.md</w:t>
+      </w:r>
+      <w:r>
+        <w:t xml:space="preserve"> M5).</w:t>
       </w:r>
     </w:p>
     <w:p/>
@@ -3706,6 +4254,74 @@
     <w:p>
       <w:r>
         <w:t>Pick based on product priority; items are independent enough to sequence differently if needed:</w:t>
+      </w:r>
+    </w:p>
+    <w:p>
+      <w:r>
+        <w:rPr>
+          <w:b/>
+        </w:rPr>
+        <w:t>If the site is about to go public, `docs/SECURITY_AND_GDPR.md` Phase S0 comes first</w:t>
+      </w:r>
+      <w:r>
+        <w:t xml:space="preserve"> — it is the only item on this list with legal exposure attached. Everything below assumes the site is still development-only.</w:t>
+      </w:r>
+    </w:p>
+    <w:p>
+      <w:pPr>
+        <w:pStyle w:val="ListNumber"/>
+      </w:pPr>
+      <w:r>
+        <w:rPr>
+          <w:b/>
+        </w:rPr>
+        <w:t>E5 retention polish</w:t>
+      </w:r>
+      <w:r>
+        <w:t xml:space="preserve"> — remaining items in </w:t>
+      </w:r>
+      <w:r>
+        <w:rPr>
+          <w:rFonts w:ascii="Consolas" w:hAnsi="Consolas"/>
+          <w:sz w:val="20"/>
+        </w:rPr>
+        <w:t>docs/ENGAGEMENT_E5.md</w:t>
+      </w:r>
+      <w:r>
+        <w:t xml:space="preserve">. </w:t>
+      </w:r>
+      <w:r>
+        <w:rPr>
+          <w:b/>
+        </w:rPr>
+        <w:t>E5.2 badges shipped.</w:t>
+      </w:r>
+      <w:r>
+        <w:t xml:space="preserve"> Suggested next: avatar unlocks → QOTD week → buddy v0.5 → streak freeze → planner dropdown.</w:t>
+      </w:r>
+    </w:p>
+    <w:p>
+      <w:pPr>
+        <w:pStyle w:val="ListNumber"/>
+      </w:pPr>
+      <w:r>
+        <w:rPr>
+          <w:b/>
+        </w:rPr>
+        <w:t>E4.1 real-world question style</w:t>
+      </w:r>
+      <w:r>
+        <w:t xml:space="preserve"> — highest content value per line of code (</w:t>
+      </w:r>
+      <w:r>
+        <w:rPr>
+          <w:rFonts w:ascii="Consolas" w:hAnsi="Consolas"/>
+          <w:sz w:val="20"/>
+        </w:rPr>
+        <w:t>docs/REAL_WORLD_QUESTIONS.md</w:t>
+      </w:r>
+      <w:r>
+        <w:t>).</w:t>
       </w:r>
     </w:p>
     <w:p>
@@ -3729,7 +4345,7 @@
         <w:t>docs/POTENTIAL_FUTURE_FUNCTIONALITY.md</w:t>
       </w:r>
       <w:r>
-        <w:t xml:space="preserve"> §2.</w:t>
+        <w:t xml:space="preserve"> §2. Note this adds teacher oversight of children's data — DPIA review required first.</w:t>
       </w:r>
     </w:p>
     <w:p>
@@ -3753,7 +4369,7 @@
         <w:t>docs/MOBILE.md</w:t>
       </w:r>
       <w:r>
-        <w:t xml:space="preserve"> (M0–M4 done).</w:t>
+        <w:t xml:space="preserve"> (M0–M4 done). Pair with compliance S0; unblocks web push (E5.7).</w:t>
       </w:r>
     </w:p>
     <w:p>
@@ -3764,10 +4380,10 @@
         <w:rPr>
           <w:b/>
         </w:rPr>
-        <w:t>E4 / other stretch</w:t>
+        <w:t>E4.2 / E4.3 and other stretch</w:t>
       </w:r>
       <w:r>
-        <w:t xml:space="preserve"> only after metrics or explicit product call — future-functionality doc.</w:t>
+        <w:t xml:space="preserve"> only after metrics or an explicit product call.</w:t>
       </w:r>
     </w:p>
     <w:p/>

</xml_diff>

<commit_message>
Ship E5.1 buddy v0.5 with on-page coach and friend_challenge prompts.
Complete the corner widget message types, per-type faces, MCQ refetch, milestone dismiss, and friend challenge nudge so retention polish is ready to merge.

Co-authored-by: Cursor <cursoragent@cursor.com>
</commit_message>
<xml_diff>
--- a/docs/AI_HANDOFF.docx
+++ b/docs/AI_HANDOFF.docx
@@ -18,7 +18,7 @@
         <w:t>Last updated:</w:t>
       </w:r>
       <w:r>
-        <w:t xml:space="preserve"> 2026-08-16</w:t>
+        <w:t xml:space="preserve"> 2026-08-17</w:t>
       </w:r>
     </w:p>
     <w:p>
@@ -2101,6 +2101,9 @@
               </w:rPr>
               <w:t>GET /api/v1/me/buddy</w:t>
             </w:r>
+            <w:r>
+              <w:t xml:space="preserve"> (optional current topic → Practise MCQ / Take a quiz / Keep learning)</w:t>
+            </w:r>
           </w:p>
         </w:tc>
       </w:tr>

</xml_diff>